<commit_message>
Agregar evidencias fase 1 de Daniel Rioseco y Nelson Maureira, actualizar documentos
</commit_message>
<xml_diff>
--- a/evidencias/fase1/individual/Jonatan Roa/1.2_APT122_DiarioReflexionFase1.docx
+++ b/evidencias/fase1/individual/Jonatan Roa/1.2_APT122_DiarioReflexionFase1.docx
@@ -210,23 +210,7 @@
                 <w:sz w:val="24"/>
                 <w:szCs w:val="24"/>
               </w:rPr>
-              <w:t>Puedes responder en cada una de las secciones por pregunta e</w:t>
-            </w:r>
-            <w:r>
-              <w:rPr>
-                <w:rFonts w:eastAsiaTheme="majorEastAsia"/>
-                <w:sz w:val="24"/>
-                <w:szCs w:val="24"/>
-              </w:rPr>
-              <w:t xml:space="preserve">n </w:t>
-            </w:r>
-            <w:r>
-              <w:rPr>
-                <w:rFonts w:eastAsiaTheme="majorEastAsia"/>
-                <w:sz w:val="24"/>
-                <w:szCs w:val="24"/>
-              </w:rPr>
-              <w:t>esta guía y, posteriormente, cargarla en la sección de reflexión de la Fase 1, para retroalimentación de tu docente.</w:t>
+              <w:t xml:space="preserve">Puedes responder en cada una de las secciones por pregunta en esta guía y, posteriormente, cargarla en la sección de reflexión de la Fase 1, para retroalimentación de tu docente.</w:t>
             </w:r>
           </w:p>
         </w:tc>
@@ -339,15 +323,7 @@
                 <w:sz w:val="24"/>
                 <w:szCs w:val="24"/>
               </w:rPr>
-              <w:t>¿Cuáles son las asignaturas o certificados que más te gustaron y/o se relacionan con tus intereses profesionales? ¿Qué es lo que más te gustó de cada uno?</w:t>
-            </w:r>
-            <w:r>
-              <w:rPr>
-                <w:rFonts w:eastAsiaTheme="majorEastAsia"/>
-                <w:sz w:val="24"/>
-                <w:szCs w:val="24"/>
-              </w:rPr>
-              <w:t xml:space="preserve"> </w:t>
+              <w:t xml:space="preserve">¿Cuáles son las asignaturas o certificados que más te gustaron y/o se relacionan con tus intereses profesionales? ¿Qué es lo que más te gustó de cada uno? </w:t>
             </w:r>
           </w:p>
           <w:p>
@@ -418,31 +394,7 @@
                 <w:sz w:val="24"/>
                 <w:szCs w:val="24"/>
               </w:rPr>
-              <w:t>A partir de las c</w:t>
-            </w:r>
-            <w:r>
-              <w:rPr>
-                <w:rFonts w:eastAsiaTheme="majorEastAsia"/>
-                <w:sz w:val="24"/>
-                <w:szCs w:val="24"/>
-              </w:rPr>
-              <w:t>ertificaciones que obtienes a lo</w:t>
-            </w:r>
-            <w:r>
-              <w:rPr>
-                <w:rFonts w:eastAsiaTheme="majorEastAsia"/>
-                <w:sz w:val="24"/>
-                <w:szCs w:val="24"/>
-              </w:rPr>
-              <w:t xml:space="preserve"> largo de la carrera ¿Existe valor en la o las certificaciones obtenidas</w:t>
-            </w:r>
-            <w:r>
-              <w:rPr>
-                <w:rFonts w:eastAsiaTheme="majorEastAsia"/>
-                <w:sz w:val="24"/>
-                <w:szCs w:val="24"/>
-              </w:rPr>
-              <w:t>? ¿Por qué?</w:t>
+              <w:t xml:space="preserve">A partir de las certificaciones que obtienes a lo largo de la carrera ¿Existe valor en la o las certificaciones obtenidas? ¿Por qué?</w:t>
             </w:r>
           </w:p>
           <w:p>
@@ -817,7 +769,51 @@
               </w:rPr>
             </w:pPr>
             <w:r>
-              <w:t>Las competencias que tengo más desarrolladas y en las que me siento más seguro son las de desarrollo de soluciones de software y construcción de modelos de datos, porque las he aplicado en múltiples proyectos académicos y personales. Me siento más débil en la realización de pruebas de certificación y en la gestión formal de proyectos informáticos, por lo que son las que necesito fortalecer durante el proyecto APT.</w:t>
+              <w:t xml:space="preserve">Las competencias que tengo más desarrolladas y en las que me siento más seguro son las de </w:t>
+            </w:r>
+            <w:r>
+              <w:rPr>
+                <w:b/>
+                <w:bCs/>
+                <w:color w:val="385623" w:themeColor="accent6" w:themeShade="80"/>
+              </w:rPr>
+              <w:t>desarrollo de soluciones de software</w:t>
+            </w:r>
+            <w:r>
+              <w:t xml:space="preserve"> y </w:t>
+            </w:r>
+            <w:r>
+              <w:rPr>
+                <w:b/>
+                <w:bCs/>
+                <w:color w:val="385623" w:themeColor="accent6" w:themeShade="80"/>
+              </w:rPr>
+              <w:t>construcción de modelos de datos</w:t>
+            </w:r>
+            <w:r>
+              <w:t xml:space="preserve">, porque las he aplicado en múltiples proyectos académicos y personales. Me siento más débil en la </w:t>
+            </w:r>
+            <w:r>
+              <w:rPr>
+                <w:b/>
+                <w:bCs/>
+                <w:color w:val="FF0000"/>
+              </w:rPr>
+              <w:t>realización de pruebas de certificación</w:t>
+            </w:r>
+            <w:r>
+              <w:t xml:space="preserve"> y en la </w:t>
+            </w:r>
+            <w:r>
+              <w:rPr>
+                <w:b/>
+                <w:bCs/>
+                <w:color w:val="FF0000"/>
+              </w:rPr>
+              <w:t>gestión formal de proyectos informáticos</w:t>
+            </w:r>
+            <w:r>
+              <w:t xml:space="preserve">, por lo que son las que necesito fortalecer durante el proyecto APT.</w:t>
             </w:r>
           </w:p>
           <w:p>
@@ -1942,7 +1938,7 @@
               </w:rPr>
             </w:pPr>
             <w:r>
-              <w:t>Sí, se relacionan directamente con mis proyecciones profesionales actuales. El proyecto de chatbot de soporte con IA es el que más se relaciona, porque combina desarrollo de software, integración de sistemas e inteligencia artificial. Requiere ajustes menores para acotar el alcance a un MVP realizable en el semestre.</w:t>
+              <w:t>Sí, se relacionan directamente con mis proyecciones profesionales actuales. El proyecto que finalmente fue asignado a mi equipo para este semestre es WellQ API, el backend de WellQ, una aplicación móvil de fisioterapia de una clínica del Reino Unido cuyo valor diferencial es el seguimiento objetivo de la rehabilitación mediante datos de wearables. El objetivo es construir un backend propio que replique los endpoints de consulta que la app WellQ obtiene hoy a través de Spike (un intermediario de integración con más de 15 proveedores de wearables) e incorpore de forma nativa nuevos proveedores, de modo que la app pueda apuntar a nuestro servidor con un comportamiento equivalente. Este proyecto reemplaza al de chatbot de soporte con IA que había diseñado en el curso anterior, y es el que más se relaciona con mis intereses, porque combina desarrollo de software, integración de sistemas (APIs externas de wearables) y diseño de arquitectura backend. Requiere ajustar el enfoque hacia autenticación (HMAC-SHA256 y JWT), consumo e implementación de APIs REST, y manejo de datos de series de tiempo de salud, en lugar de procesamiento de lenguaje natural.</w:t>
             </w:r>
           </w:p>
           <w:p>
@@ -2115,7 +2111,7 @@
               </w:rPr>
             </w:pPr>
             <w:r>
-              <w:t>El área de desempeño que aborda este proyecto es el desarrollo e integración de soluciones de software con IA. Un proyecto de este tipo me ayuda a desarrollarme profesionalmente, pues me permite aplicar lo aprendido en la carrera en un contexto real. Se sitúa en el contexto de empresas SaaS que ofrecen soporte automatizado a sus usuarios.</w:t>
+              <w:t>No aplica: sí existe un proyecto de la carrera anterior que se relaciona (respondido en la pregunta anterior).</w:t>
             </w:r>
           </w:p>
           <w:p>
@@ -2166,12 +2162,7 @@
               </w:rPr>
             </w:pPr>
             <w:r>
-              <w:rPr>
-                <w:rFonts w:eastAsiaTheme="majorEastAsia"/>
-                <w:sz w:val="24"/>
-                <w:szCs w:val="24"/>
-              </w:rPr>
-              <w:t xml:space="preserve">¿Qué tipo de proyecto podría ayudarte más en tu desarrollo profesional? </w:t>
+              <w:t>El área de desempeño principal es el desarrollo e integración de soluciones de software, en particular la integración de APIs REST de terceros (proveedores de wearables), el diseño de arquitectura backend, la implementación de autenticación y seguridad (HMAC-SHA256 y JWT) y la gestión de datos de series de tiempo de salud. También aborda la gestión de proyectos informáticos, ya que implica coordinar el desarrollo con el equipo y con los requerimientos de la empresa WellQ.</w:t>
             </w:r>
           </w:p>
           <w:p>
@@ -2199,7 +2190,81 @@
                 <w:sz w:val="24"/>
                 <w:szCs w:val="24"/>
               </w:rPr>
+              <w:t xml:space="preserve">¿Qué tipo de proyecto podría ayudarte más en tu desarrollo profesional? </w:t>
+            </w:r>
+          </w:p>
+          <w:p>
+            <w:pPr>
+              <w:pStyle w:val="Prrafodelista"/>
+              <w:numPr>
+                <w:ilvl w:val="0"/>
+                <w:numId w:val="12"/>
+              </w:numPr>
+              <w:tabs>
+                <w:tab w:val="left" w:pos="1021"/>
+              </w:tabs>
+              <w:ind w:left="454" w:firstLine="142"/>
+              <w:jc w:val="both"/>
+              <w:rPr>
+                <w:rFonts w:eastAsiaTheme="majorEastAsia"/>
+                <w:color w:val="767171" w:themeColor="background2" w:themeShade="80"/>
+                <w:sz w:val="24"/>
+                <w:szCs w:val="24"/>
+              </w:rPr>
+            </w:pPr>
+            <w:r>
+              <w:t>Un proyecto que me ayudaría más es uno de integración de sistemas backend con datos reales de una empresa real, como WellQ API, donde deba diseñar e implementar APIs propias, consumir servicios externos y trabajar con datos reales (en este caso, de salud y wearables). Este tipo de proyecto me permite reforzar mis intereses en desarrollo de software y aplicar conocimientos de arquitectura, autenticación y modelamiento de datos en un contexto con exigencias y estándares de una empresa cliente.</w:t>
+            </w:r>
+          </w:p>
+          <w:p>
+            <w:pPr>
+              <w:pStyle w:val="Prrafodelista"/>
+              <w:numPr>
+                <w:ilvl w:val="0"/>
+                <w:numId w:val="12"/>
+              </w:numPr>
+              <w:tabs>
+                <w:tab w:val="left" w:pos="1021"/>
+              </w:tabs>
+              <w:ind w:left="454" w:firstLine="142"/>
+              <w:jc w:val="both"/>
+              <w:rPr>
+                <w:rFonts w:eastAsiaTheme="majorEastAsia"/>
+                <w:color w:val="767171" w:themeColor="background2" w:themeShade="80"/>
+                <w:sz w:val="24"/>
+                <w:szCs w:val="24"/>
+              </w:rPr>
+            </w:pPr>
+            <w:r>
+              <w:rPr>
+                <w:rFonts w:eastAsiaTheme="majorEastAsia"/>
+                <w:sz w:val="24"/>
+                <w:szCs w:val="24"/>
+              </w:rPr>
               <w:t xml:space="preserve">¿En qué contexto se debería situar este Proyecto APT?  </w:t>
+            </w:r>
+          </w:p>
+          <w:p>
+            <w:pPr>
+              <w:pStyle w:val="Prrafodelista"/>
+              <w:numPr>
+                <w:ilvl w:val="0"/>
+                <w:numId w:val="12"/>
+              </w:numPr>
+              <w:tabs>
+                <w:tab w:val="left" w:pos="1021"/>
+              </w:tabs>
+              <w:ind w:left="454" w:firstLine="142"/>
+              <w:jc w:val="both"/>
+              <w:rPr>
+                <w:rFonts w:eastAsiaTheme="majorEastAsia"/>
+                <w:color w:val="767171" w:themeColor="background2" w:themeShade="80"/>
+                <w:sz w:val="24"/>
+                <w:szCs w:val="24"/>
+              </w:rPr>
+            </w:pPr>
+            <w:r>
+              <w:t>Se sitúa en el contexto de empresas de salud digital (healthtech) que dependen de un intermediario externo, como Spike, para integrar datos de distintos proveedores de wearables, y que buscan reducir esa dependencia desarrollando capacidades propias de integración. En este caso, es el contexto de WellQ, una clínica de fisioterapia del Reino Unido que necesita un backend propio para su app de seguimiento de rehabilitación con wearables.</w:t>
             </w:r>
           </w:p>
           <w:p>

</xml_diff>